<commit_message>
added documents from repo
</commit_message>
<xml_diff>
--- a/docs_storage/test_spec.docx
+++ b/docs_storage/test_spec.docx
@@ -2,14 +2,6 @@
 <file path=word/document.xml><?xml version="1.0" encoding="utf-8"?>
 <w:document xmlns:wpc="http://schemas.microsoft.com/office/word/2010/wordprocessingCanvas" xmlns:mo="http://schemas.microsoft.com/office/mac/office/2008/main" xmlns:mc="http://schemas.openxmlformats.org/markup-compatibility/2006" xmlns:mv="urn:schemas-microsoft-com:mac:vml" xmlns:o="urn:schemas-microsoft-com:office:office" xmlns:r="http://schemas.openxmlformats.org/officeDocument/2006/relationships" xmlns:m="http://schemas.openxmlformats.org/officeDocument/2006/math" xmlns:v="urn:schemas-microsoft-com:vml" xmlns:wp14="http://schemas.microsoft.com/office/word/2010/wordprocessingDrawing" xmlns:wp="http://schemas.openxmlformats.org/drawingml/2006/wordprocessingDrawing" xmlns:w10="urn:schemas-microsoft-com:office:word" xmlns:w="http://schemas.openxmlformats.org/wordprocessingml/2006/main" xmlns:w14="http://schemas.microsoft.com/office/word/2010/wordml" xmlns:wpg="http://schemas.microsoft.com/office/word/2010/wordprocessingGroup" xmlns:wpi="http://schemas.microsoft.com/office/word/2010/wordprocessingInk" xmlns:wne="http://schemas.microsoft.com/office/word/2006/wordml" xmlns:wps="http://schemas.microsoft.com/office/word/2010/wordprocessingShape" mc:Ignorable="w14 wp14">
   <w:body>
-    <w:p>
-      <w:pPr>
-        <w:pStyle w:val="Heading1"/>
-      </w:pPr>
-      <w:r>
-        <w:t>Word Technical Guide</w:t>
-      </w:r>
-    </w:p>
     <w:p>
       <w:pPr>
         <w:pStyle w:val="Heading2"/>
@@ -21,6 +13,292 @@
     <w:p>
       <w:r>
         <w:t>Python 3.10+</w:t>
+      </w:r>
+    </w:p>
+    <w:p>
+      <w:r>
+        <w:t>I want to have a guide of the request and how was solved (pull request) by the users in teams:</w:t>
+        <w:br/>
+        <w:t>hi dos Santos Henrique (Contractor) ticket update Form - ServiceCafe RITM12417194 (for pre signed url - DE PPD) " role granted to SA.."</w:t>
+        <w:br/>
+        <w:t xml:space="preserve"> </w:t>
+        <w:br/>
+        <w:t>Hi Sharma Vemu (Contractor) fyi for this ticket  RITM12411039 (for Plexure sftp and api call) which has been stuck Form - ServiceCafe the poc has replied to my msg and looking at the request.</w:t>
+        <w:br/>
+        <w:t xml:space="preserve"> </w:t>
+        <w:br/>
+        <w:t>Region AU</w:t>
+        <w:br/>
+        <w:t xml:space="preserve"> </w:t>
+        <w:br/>
+        <w:t>VM : g-ppdam-au-pe3-general-uc1-c-001</w:t>
+        <w:br/>
+        <w:t xml:space="preserve"> </w:t>
+        <w:br/>
+        <w:t>Bucket --&gt; g-ppdam-au-pe3-composer-uc1-gcs01   --&gt; Working</w:t>
+      </w:r>
+    </w:p>
+    <w:p>
+      <w:r>
+        <w:t>Bucket --&gt; g-ppdam-au-pe3-general-uc1-gcs01    --&gt; Working</w:t>
+      </w:r>
+    </w:p>
+    <w:p>
+      <w:r>
+        <w:t>Bucket --&gt; g-ppdam-au-pe3-spark-uc1-gcs01      --&gt; Working</w:t>
+      </w:r>
+    </w:p>
+    <w:p>
+      <w:r>
+        <w:t>Bucket --&gt; g-ppdam-cp-pe3-auapp-uc1-gcs01      --&gt; Working</w:t>
+      </w:r>
+    </w:p>
+    <w:p>
+      <w:r>
+        <w:t>Bucket --&gt; g-ppdam-cp-pe3-aumcdp-uc1-gcs01     --&gt; Working</w:t>
+      </w:r>
+    </w:p>
+    <w:p>
+      <w:r>
+        <w:t>Bucket --&gt; g-ppdam-cp-pe3-auvce-uc1-gcs01      --&gt; Working</w:t>
+        <w:br/>
+        <w:t xml:space="preserve"> </w:t>
+        <w:br/>
+        <w:t>Secrets --&gt; g-ppdam-au-pe3-general-secret-gbl-secret --&gt; NOT WORKING</w:t>
+        <w:br/>
+        <w:t xml:space="preserve"> </w:t>
+        <w:br/>
+        <w:t xml:space="preserve"> </w:t>
+        <w:br/>
+        <w:t>Region : CA</w:t>
+        <w:br/>
+        <w:t xml:space="preserve"> </w:t>
+        <w:br/>
+        <w:t xml:space="preserve">VM :  g-ppdam-ca-pe3-general-uc1-c-001   </w:t>
+        <w:br/>
+        <w:t xml:space="preserve"> </w:t>
+        <w:br/>
+        <w:t>Bucket  --&gt; g-ppdam-ca-pe3-composer-uc1-gcs01  --&gt;  Working</w:t>
+      </w:r>
+    </w:p>
+    <w:p>
+      <w:r>
+        <w:t>Bucket  --&gt; g-ppdam-ca-pe3-general-uc1-gcs01   --&gt;  Working</w:t>
+      </w:r>
+    </w:p>
+    <w:p>
+      <w:r>
+        <w:t>Bucket  --&gt; g-ppdam-ca-pe3-spark-uc1-gcs01     --&gt;  Working</w:t>
+      </w:r>
+    </w:p>
+    <w:p>
+      <w:r>
+        <w:t>Bucket  --&gt; g-ppdam-cp-pe3-cavce-uc1-gcs01     --&gt;  Working</w:t>
+      </w:r>
+    </w:p>
+    <w:p>
+      <w:r>
+        <w:t>Bucket  --&gt; g-ppdam-cp-pe3-camcdp-uc1-gcs01    --&gt;  Working</w:t>
+      </w:r>
+    </w:p>
+    <w:p>
+      <w:r>
+        <w:t>Bucket  --&gt; g-ppdam-cp-pe3-caapp-uc1-gcs01     --&gt;  Working</w:t>
+        <w:br/>
+        <w:t xml:space="preserve"> </w:t>
+        <w:br/>
+        <w:t>Secrets --&gt; g-ppdam-ca-pe3-general-secret-gbl-secret --&gt; working</w:t>
+        <w:br/>
+        <w:t xml:space="preserve"> </w:t>
+        <w:br/>
+        <w:t xml:space="preserve"> </w:t>
+        <w:br/>
+        <w:t>Region AU</w:t>
+        <w:br/>
+        <w:t xml:space="preserve"> </w:t>
+        <w:br/>
+        <w:t>VM : g-devam-au-pe3-general-uc1-a-001</w:t>
+        <w:br/>
+        <w:t xml:space="preserve"> </w:t>
+        <w:br/>
+        <w:t>Bucket --&gt; g-devam-au-pe3-composer-uc1-gcs01   --&gt; Working</w:t>
+      </w:r>
+    </w:p>
+    <w:p>
+      <w:r>
+        <w:t>Bucket --&gt; g-devam-au-pe3-general-uc1-gcs01    --&gt; Working</w:t>
+      </w:r>
+    </w:p>
+    <w:p>
+      <w:r>
+        <w:t>Bucket --&gt; g-devam-au-pe3-spark-uc1-gcs01      --&gt; Working</w:t>
+      </w:r>
+    </w:p>
+    <w:p>
+      <w:r>
+        <w:t>Bucket --&gt; g-devam-cp-pe3-auapp-uc1-gcs01      --&gt; Working</w:t>
+      </w:r>
+    </w:p>
+    <w:p>
+      <w:r>
+        <w:t>Bucket --&gt; g-devam-cp-pe3-aumcdp-uc1-gcs01     --&gt; Working</w:t>
+      </w:r>
+    </w:p>
+    <w:p>
+      <w:r>
+        <w:t>Bucket --&gt; g-devam-cp-pe3-auvce-uc1-gcs01      --&gt; Working</w:t>
+        <w:br/>
+        <w:t xml:space="preserve"> </w:t>
+        <w:br/>
+        <w:t>Secrets --&gt; g-devam-au-pe3-general-secret-gbl-secret --&gt; Working</w:t>
+        <w:br/>
+        <w:t xml:space="preserve"> </w:t>
+        <w:br/>
+        <w:t>Region : CA</w:t>
+        <w:br/>
+        <w:t xml:space="preserve"> </w:t>
+        <w:br/>
+        <w:t xml:space="preserve">VM :  g-devam-ca-pe3-general-uc1-a-001   </w:t>
+        <w:br/>
+        <w:t xml:space="preserve"> </w:t>
+        <w:br/>
+        <w:t>Bucket  --&gt; g-devam-ca-pe3-composer-uc1-gcs01  --&gt;  Working</w:t>
+      </w:r>
+    </w:p>
+    <w:p>
+      <w:r>
+        <w:t>Bucket  --&gt; g-devam-ca-pe3-general-uc1-gcs01   --&gt;  Working</w:t>
+      </w:r>
+    </w:p>
+    <w:p>
+      <w:r>
+        <w:t>Bucket  --&gt; g-devam-ca-pe3-spark-uc1-gcs01     --&gt;  Working</w:t>
+      </w:r>
+    </w:p>
+    <w:p>
+      <w:r>
+        <w:t>Bucket  --&gt; g-devam-cp-pe3-cavce-uc1-gcs01     --&gt;  Working</w:t>
+      </w:r>
+    </w:p>
+    <w:p>
+      <w:r>
+        <w:t>Bucket  --&gt; g-devam-cp-pe3-camcdp-uc1-gcs01    --&gt;  Working</w:t>
+      </w:r>
+    </w:p>
+    <w:p>
+      <w:r>
+        <w:t>Bucket  --&gt; g-devam-cp-pe3-caapp-uc1-gcs01     --&gt;  Working</w:t>
+        <w:br/>
+        <w:t xml:space="preserve"> </w:t>
+        <w:br/>
+        <w:t>Secrets --&gt; g-devam-ca-pe3-general-secret-gbl-secret --&gt; working</w:t>
+        <w:br/>
+        <w:t xml:space="preserve"> </w:t>
+        <w:br/>
+        <w:t xml:space="preserve"> </w:t>
+        <w:br/>
+        <w:t>Hi dos Santos Henrique (Contractor) Sharma Vemu (Contractor)</w:t>
+        <w:br/>
+        <w:t>Secrets for AU PPD is unable to access</w:t>
+        <w:br/>
+        <w:t xml:space="preserve"> </w:t>
+        <w:br/>
+        <w:t>I need the errors Sharma. Where are you trying to access? From VM ?</w:t>
+        <w:br/>
+        <w:t xml:space="preserve"> </w:t>
+        <w:br/>
+        <w:t>dos Santos Henrique (Contractor)</w:t>
+        <w:br/>
+        <w:t>I need the errors Sharma. Where are you trying to access? From VM ?</w:t>
+        <w:br/>
+        <w:t>Screenshot 2026-07-21 at 9.01.41 AM.png</w:t>
+        <w:br/>
+        <w:t xml:space="preserve"> </w:t>
+        <w:br/>
+        <w:t>Ok thanks. Checking</w:t>
+        <w:br/>
+        <w:t xml:space="preserve"> </w:t>
+        <w:br/>
+        <w:t>Chatna Partha (Contractor)</w:t>
+        <w:br/>
+        <w:t>📄</w:t>
+        <w:br/>
+        <w:t xml:space="preserve">Need to add version to the secret. </w:t>
+        <w:br/>
+        <w:t xml:space="preserve"> </w:t>
+        <w:br/>
+        <w:t>Dont have any version. Permission is fine</w:t>
+        <w:br/>
+        <w:t xml:space="preserve"> </w:t>
+        <w:br/>
+        <w:t>Chatna Partha (Contractor) If you do not find any versions, create one. If you are unable to do so, take help from Prathap</w:t>
+        <w:br/>
+        <w:t xml:space="preserve"> </w:t>
+        <w:br/>
+        <w:t>Elias Israel (Contractor) please create databases in g-ppdam-de-pe3-sui-uc1-a-csql01</w:t>
+        <w:br/>
+        <w:t>pe3_offer_calender_de</w:t>
+      </w:r>
+    </w:p>
+    <w:p>
+      <w:r>
+        <w:t>pe3_app_de</w:t>
+      </w:r>
+    </w:p>
+    <w:p>
+      <w:r>
+        <w:t>vcede</w:t>
+      </w:r>
+    </w:p>
+    <w:p>
+      <w:r>
+        <w:t>test_pe3</w:t>
+        <w:br/>
+        <w:t xml:space="preserve"> </w:t>
+        <w:br/>
+        <w:t xml:space="preserve"> </w:t>
+        <w:br/>
+        <w:t>Sharma Vemu (Contractor)</w:t>
+        <w:br/>
+        <w:t>ToDo's: GMAL DEV Cloud Run to CloudSQL issue. –Isreal need to investigate (discuss with naga and deep) CloudSQL details – Sharma DE-ppd and Dev’s by EOD DE Dev Dataproc issues – Unable to submit jobs…</w:t>
+        <w:br/>
+        <w:t>Hi dos Santos Henrique (Contractor) how are we doing with these?</w:t>
+        <w:br/>
+        <w:t xml:space="preserve"> </w:t>
+        <w:br/>
+        <w:t>Almost done</w:t>
+        <w:br/>
+        <w:t xml:space="preserve"> </w:t>
+        <w:br/>
+        <w:t>In reality, already done. I am just doing some validations</w:t>
+        <w:br/>
+        <w:t xml:space="preserve"> </w:t>
+        <w:br/>
+        <w:t>we have the next call in 15 mins</w:t>
+        <w:br/>
+        <w:t xml:space="preserve"> </w:t>
+        <w:br/>
+        <w:t>Hi Elias Israel (Contractor) needs your response Form - ServiceCafe</w:t>
+        <w:br/>
+        <w:t xml:space="preserve"> </w:t>
+        <w:br/>
+        <w:t xml:space="preserve">Furman J.R. (Contractor)/Nandamuri Deep (Contractor) </w:t>
+        <w:br/>
+        <w:t>feat(ppd-pe3-deus): add databases to g-ppdam-de-pe3-sui-uc1-a-csql01</w:t>
+        <w:br/>
+        <w:t xml:space="preserve"> </w:t>
+        <w:br/>
+        <w:t>Nandamuri Deep (Contractor).</w:t>
+        <w:br/>
+        <w:t xml:space="preserve"> </w:t>
+        <w:br/>
+        <w:t>https://github.com/mcd-gcp-terraform-org/mcdpricing-infra/pull/434</w:t>
+        <w:br/>
+        <w:t xml:space="preserve"> </w:t>
+        <w:br/>
+        <w:t>Hi dos Santos Henrique (Contractor) can you pls look into this VM g-ppdam-us-pe2eu-general-uc1-a-001</w:t>
+        <w:br/>
+        <w:t>unable to access this</w:t>
       </w:r>
     </w:p>
     <w:sectPr>

</xml_diff>